<commit_message>
Updated MOVICS baseline figures (plotdata)
</commit_message>
<xml_diff>
--- a/Results/MOVICS_baseline/transNEO_Summary_of_clinical_variables.docx
+++ b/Results/MOVICS_baseline/transNEO_Summary_of_clinical_variables.docx
@@ -110,17 +110,17 @@
               <w:pStyle w:stlname="Normal" w:val="Normal"/>
             </w:pPr>
             <w:r>
-              <w:t>   76</w:t>
-            </w:r>
-          </w:p>
-        </w:tc>
-        <w:tc>
-          <w:p>
-            <w:pPr>
-              <w:pStyle w:stlname="Normal" w:val="Normal"/>
-            </w:pPr>
-            <w:r>
-              <w:t>   77</w:t>
+              <w:t>   75</w:t>
+            </w:r>
+          </w:p>
+        </w:tc>
+        <w:tc>
+          <w:p>
+            <w:pPr>
+              <w:pStyle w:stlname="Normal" w:val="Normal"/>
+            </w:pPr>
+            <w:r>
+              <w:t>   78</w:t>
             </w:r>
           </w:p>
         </w:tc>
@@ -172,7 +172,7 @@
               <w:pStyle w:stlname="Normal" w:val="Normal"/>
             </w:pPr>
             <w:r>
-              <w:t>   76 (100.0) </w:t>
+              <w:t>   75 (100.0) </w:t>
             </w:r>
           </w:p>
         </w:tc>
@@ -244,7 +244,7 @@
               <w:pStyle w:stlname="Normal" w:val="Normal"/>
             </w:pPr>
             <w:r>
-              <w:t>   77 (100.0) </w:t>
+              <w:t>   78 (100.0) </w:t>
             </w:r>
           </w:p>
         </w:tc>
@@ -296,27 +296,27 @@
               <w:pStyle w:stlname="Normal" w:val="Normal"/>
             </w:pPr>
             <w:r>
-              <w:t>   45 ( 59.2) </w:t>
-            </w:r>
-          </w:p>
-        </w:tc>
-        <w:tc>
-          <w:p>
-            <w:pPr>
-              <w:pStyle w:stlname="Normal" w:val="Normal"/>
-            </w:pPr>
-            <w:r>
-              <w:t>   29 ( 37.7) </w:t>
-            </w:r>
-          </w:p>
-        </w:tc>
-        <w:tc>
-          <w:p>
-            <w:pPr>
-              <w:pStyle w:stlname="Normal" w:val="Normal"/>
-            </w:pPr>
-            <w:r>
-              <w:t> 0.012</w:t>
+              <w:t>   44 ( 58.7) </w:t>
+            </w:r>
+          </w:p>
+        </w:tc>
+        <w:tc>
+          <w:p>
+            <w:pPr>
+              <w:pStyle w:stlname="Normal" w:val="Normal"/>
+            </w:pPr>
+            <w:r>
+              <w:t>   30 ( 38.5) </w:t>
+            </w:r>
+          </w:p>
+        </w:tc>
+        <w:tc>
+          <w:p>
+            <w:pPr>
+              <w:pStyle w:stlname="Normal" w:val="Normal"/>
+            </w:pPr>
+            <w:r>
+              <w:t> 0.019</w:t>
             </w:r>
           </w:p>
         </w:tc>
@@ -358,17 +358,17 @@
               <w:pStyle w:stlname="Normal" w:val="Normal"/>
             </w:pPr>
             <w:r>
-              <w:t>   31 ( 40.8) </w:t>
-            </w:r>
-          </w:p>
-        </w:tc>
-        <w:tc>
-          <w:p>
-            <w:pPr>
-              <w:pStyle w:stlname="Normal" w:val="Normal"/>
-            </w:pPr>
-            <w:r>
-              <w:t>   48 ( 62.3) </w:t>
+              <w:t>   31 ( 41.3) </w:t>
+            </w:r>
+          </w:p>
+        </w:tc>
+        <w:tc>
+          <w:p>
+            <w:pPr>
+              <w:pStyle w:stlname="Normal" w:val="Normal"/>
+            </w:pPr>
+            <w:r>
+              <w:t>   48 ( 61.5) </w:t>
             </w:r>
           </w:p>
         </w:tc>
@@ -420,27 +420,27 @@
               <w:pStyle w:stlname="Normal" w:val="Normal"/>
             </w:pPr>
             <w:r>
-              <w:t>   34 ( 44.7) </w:t>
-            </w:r>
-          </w:p>
-        </w:tc>
-        <w:tc>
-          <w:p>
-            <w:pPr>
-              <w:pStyle w:stlname="Normal" w:val="Normal"/>
-            </w:pPr>
-            <w:r>
-              <w:t>   17 ( 22.1) </w:t>
-            </w:r>
-          </w:p>
-        </w:tc>
-        <w:tc>
-          <w:p>
-            <w:pPr>
-              <w:pStyle w:stlname="Normal" w:val="Normal"/>
-            </w:pPr>
-            <w:r>
-              <w:t> 0.005</w:t>
+              <w:t>   33 ( 44.0) </w:t>
+            </w:r>
+          </w:p>
+        </w:tc>
+        <w:tc>
+          <w:p>
+            <w:pPr>
+              <w:pStyle w:stlname="Normal" w:val="Normal"/>
+            </w:pPr>
+            <w:r>
+              <w:t>   18 ( 23.1) </w:t>
+            </w:r>
+          </w:p>
+        </w:tc>
+        <w:tc>
+          <w:p>
+            <w:pPr>
+              <w:pStyle w:stlname="Normal" w:val="Normal"/>
+            </w:pPr>
+            <w:r>
+              <w:t> 0.010</w:t>
             </w:r>
           </w:p>
         </w:tc>
@@ -482,17 +482,17 @@
               <w:pStyle w:stlname="Normal" w:val="Normal"/>
             </w:pPr>
             <w:r>
-              <w:t>   42 ( 55.3) </w:t>
-            </w:r>
-          </w:p>
-        </w:tc>
-        <w:tc>
-          <w:p>
-            <w:pPr>
-              <w:pStyle w:stlname="Normal" w:val="Normal"/>
-            </w:pPr>
-            <w:r>
-              <w:t>   60 ( 77.9) </w:t>
+              <w:t>   42 ( 56.0) </w:t>
+            </w:r>
+          </w:p>
+        </w:tc>
+        <w:tc>
+          <w:p>
+            <w:pPr>
+              <w:pStyle w:stlname="Normal" w:val="Normal"/>
+            </w:pPr>
+            <w:r>
+              <w:t>   60 ( 76.9) </w:t>
             </w:r>
           </w:p>
         </w:tc>
@@ -544,27 +544,27 @@
               <w:pStyle w:stlname="Normal" w:val="Normal"/>
             </w:pPr>
             <w:r>
-              <w:t>   44 ( 57.9) </w:t>
-            </w:r>
-          </w:p>
-        </w:tc>
-        <w:tc>
-          <w:p>
-            <w:pPr>
-              <w:pStyle w:stlname="Normal" w:val="Normal"/>
-            </w:pPr>
-            <w:r>
-              <w:t>   50 ( 64.9) </w:t>
-            </w:r>
-          </w:p>
-        </w:tc>
-        <w:tc>
-          <w:p>
-            <w:pPr>
-              <w:pStyle w:stlname="Normal" w:val="Normal"/>
-            </w:pPr>
-            <w:r>
-              <w:t> 0.466</w:t>
+              <w:t>   43 ( 57.3) </w:t>
+            </w:r>
+          </w:p>
+        </w:tc>
+        <w:tc>
+          <w:p>
+            <w:pPr>
+              <w:pStyle w:stlname="Normal" w:val="Normal"/>
+            </w:pPr>
+            <w:r>
+              <w:t>   51 ( 65.4) </w:t>
+            </w:r>
+          </w:p>
+        </w:tc>
+        <w:tc>
+          <w:p>
+            <w:pPr>
+              <w:pStyle w:stlname="Normal" w:val="Normal"/>
+            </w:pPr>
+            <w:r>
+              <w:t> 0.392</w:t>
             </w:r>
           </w:p>
         </w:tc>
@@ -606,17 +606,17 @@
               <w:pStyle w:stlname="Normal" w:val="Normal"/>
             </w:pPr>
             <w:r>
-              <w:t>   32 ( 42.1) </w:t>
-            </w:r>
-          </w:p>
-        </w:tc>
-        <w:tc>
-          <w:p>
-            <w:pPr>
-              <w:pStyle w:stlname="Normal" w:val="Normal"/>
-            </w:pPr>
-            <w:r>
-              <w:t>   27 ( 35.1) </w:t>
+              <w:t>   32 ( 42.7) </w:t>
+            </w:r>
+          </w:p>
+        </w:tc>
+        <w:tc>
+          <w:p>
+            <w:pPr>
+              <w:pStyle w:stlname="Normal" w:val="Normal"/>
+            </w:pPr>
+            <w:r>
+              <w:t>   27 ( 34.6) </w:t>
             </w:r>
           </w:p>
         </w:tc>
@@ -730,17 +730,17 @@
               <w:pStyle w:stlname="Normal" w:val="Normal"/>
             </w:pPr>
             <w:r>
-              <w:t>   13 ( 17.1) </w:t>
-            </w:r>
-          </w:p>
-        </w:tc>
-        <w:tc>
-          <w:p>
-            <w:pPr>
-              <w:pStyle w:stlname="Normal" w:val="Normal"/>
-            </w:pPr>
-            <w:r>
-              <w:t>   46 ( 59.7) </w:t>
+              <w:t>   13 ( 17.3) </w:t>
+            </w:r>
+          </w:p>
+        </w:tc>
+        <w:tc>
+          <w:p>
+            <w:pPr>
+              <w:pStyle w:stlname="Normal" w:val="Normal"/>
+            </w:pPr>
+            <w:r>
+              <w:t>   46 ( 59.0) </w:t>
             </w:r>
           </w:p>
         </w:tc>
@@ -792,17 +792,17 @@
               <w:pStyle w:stlname="Normal" w:val="Normal"/>
             </w:pPr>
             <w:r>
-              <w:t>   63 ( 82.9) </w:t>
-            </w:r>
-          </w:p>
-        </w:tc>
-        <w:tc>
-          <w:p>
-            <w:pPr>
-              <w:pStyle w:stlname="Normal" w:val="Normal"/>
-            </w:pPr>
-            <w:r>
-              <w:t>   31 ( 40.3) </w:t>
+              <w:t>   62 ( 82.7) </w:t>
+            </w:r>
+          </w:p>
+        </w:tc>
+        <w:tc>
+          <w:p>
+            <w:pPr>
+              <w:pStyle w:stlname="Normal" w:val="Normal"/>
+            </w:pPr>
+            <w:r>
+              <w:t>   32 ( 41.0) </w:t>
             </w:r>
           </w:p>
         </w:tc>
@@ -916,27 +916,27 @@
               <w:pStyle w:stlname="Normal" w:val="Normal"/>
             </w:pPr>
             <w:r>
-              <w:t>   27 ( 35.5) </w:t>
-            </w:r>
-          </w:p>
-        </w:tc>
-        <w:tc>
-          <w:p>
-            <w:pPr>
-              <w:pStyle w:stlname="Normal" w:val="Normal"/>
-            </w:pPr>
-            <w:r>
-              <w:t>   14 ( 18.2) </w:t>
-            </w:r>
-          </w:p>
-        </w:tc>
-        <w:tc>
-          <w:p>
-            <w:pPr>
-              <w:pStyle w:stlname="Normal" w:val="Normal"/>
-            </w:pPr>
-            <w:r>
-              <w:t> 0.025</w:t>
+              <w:t>   26 ( 34.7) </w:t>
+            </w:r>
+          </w:p>
+        </w:tc>
+        <w:tc>
+          <w:p>
+            <w:pPr>
+              <w:pStyle w:stlname="Normal" w:val="Normal"/>
+            </w:pPr>
+            <w:r>
+              <w:t>   15 ( 19.2) </w:t>
+            </w:r>
+          </w:p>
+        </w:tc>
+        <w:tc>
+          <w:p>
+            <w:pPr>
+              <w:pStyle w:stlname="Normal" w:val="Normal"/>
+            </w:pPr>
+            <w:r>
+              <w:t> 0.049</w:t>
             </w:r>
           </w:p>
         </w:tc>
@@ -978,17 +978,17 @@
               <w:pStyle w:stlname="Normal" w:val="Normal"/>
             </w:pPr>
             <w:r>
-              <w:t>   49 ( 64.5) </w:t>
-            </w:r>
-          </w:p>
-        </w:tc>
-        <w:tc>
-          <w:p>
-            <w:pPr>
-              <w:pStyle w:stlname="Normal" w:val="Normal"/>
-            </w:pPr>
-            <w:r>
-              <w:t>   63 ( 81.8) </w:t>
+              <w:t>   49 ( 65.3) </w:t>
+            </w:r>
+          </w:p>
+        </w:tc>
+        <w:tc>
+          <w:p>
+            <w:pPr>
+              <w:pStyle w:stlname="Normal" w:val="Normal"/>
+            </w:pPr>
+            <w:r>
+              <w:t>   63 ( 80.8) </w:t>
             </w:r>
           </w:p>
         </w:tc>
@@ -1050,17 +1050,17 @@
               <w:pStyle w:stlname="Normal" w:val="Normal"/>
             </w:pPr>
             <w:r>
-              <w:t>51.00 [45.00, 58.00]</w:t>
-            </w:r>
-          </w:p>
-        </w:tc>
-        <w:tc>
-          <w:p>
-            <w:pPr>
-              <w:pStyle w:stlname="Normal" w:val="Normal"/>
-            </w:pPr>
-            <w:r>
-              <w:t> 0.439</w:t>
+              <w:t>51.00 [44.25, 57.50]</w:t>
+            </w:r>
+          </w:p>
+        </w:tc>
+        <w:tc>
+          <w:p>
+            <w:pPr>
+              <w:pStyle w:stlname="Normal" w:val="Normal"/>
+            </w:pPr>
+            <w:r>
+              <w:t> 0.532</w:t>
             </w:r>
           </w:p>
         </w:tc>
@@ -1112,17 +1112,17 @@
               <w:pStyle w:stlname="Normal" w:val="Normal"/>
             </w:pPr>
             <w:r>
-              <w:t>    8 ( 10.4) </w:t>
-            </w:r>
-          </w:p>
-        </w:tc>
-        <w:tc>
-          <w:p>
-            <w:pPr>
-              <w:pStyle w:stlname="Normal" w:val="Normal"/>
-            </w:pPr>
-            <w:r>
-              <w:t> 0.283</w:t>
+              <w:t>    8 ( 10.3) </w:t>
+            </w:r>
+          </w:p>
+        </w:tc>
+        <w:tc>
+          <w:p>
+            <w:pPr>
+              <w:pStyle w:stlname="Normal" w:val="Normal"/>
+            </w:pPr>
+            <w:r>
+              <w:t> 0.210</w:t>
             </w:r>
           </w:p>
         </w:tc>
@@ -1164,17 +1164,17 @@
               <w:pStyle w:stlname="Normal" w:val="Normal"/>
             </w:pPr>
             <w:r>
-              <w:t>   50 ( 65.8) </w:t>
-            </w:r>
-          </w:p>
-        </w:tc>
-        <w:tc>
-          <w:p>
-            <w:pPr>
-              <w:pStyle w:stlname="Normal" w:val="Normal"/>
-            </w:pPr>
-            <w:r>
-              <w:t>   42 ( 54.5) </w:t>
+              <w:t>   50 ( 66.7) </w:t>
+            </w:r>
+          </w:p>
+        </w:tc>
+        <w:tc>
+          <w:p>
+            <w:pPr>
+              <w:pStyle w:stlname="Normal" w:val="Normal"/>
+            </w:pPr>
+            <w:r>
+              <w:t>   42 ( 53.8) </w:t>
             </w:r>
           </w:p>
         </w:tc>
@@ -1226,17 +1226,17 @@
               <w:pStyle w:stlname="Normal" w:val="Normal"/>
             </w:pPr>
             <w:r>
-              <w:t>   17 ( 22.4) </w:t>
-            </w:r>
-          </w:p>
-        </w:tc>
-        <w:tc>
-          <w:p>
-            <w:pPr>
-              <w:pStyle w:stlname="Normal" w:val="Normal"/>
-            </w:pPr>
-            <w:r>
-              <w:t>   24 ( 31.2) </w:t>
+              <w:t>   16 ( 21.3) </w:t>
+            </w:r>
+          </w:p>
+        </w:tc>
+        <w:tc>
+          <w:p>
+            <w:pPr>
+              <w:pStyle w:stlname="Normal" w:val="Normal"/>
+            </w:pPr>
+            <w:r>
+              <w:t>   25 ( 32.1) </w:t>
             </w:r>
           </w:p>
         </w:tc>
@@ -1288,17 +1288,17 @@
               <w:pStyle w:stlname="Normal" w:val="Normal"/>
             </w:pPr>
             <w:r>
-              <w:t>    5 (  6.6) </w:t>
-            </w:r>
-          </w:p>
-        </w:tc>
-        <w:tc>
-          <w:p>
-            <w:pPr>
-              <w:pStyle w:stlname="Normal" w:val="Normal"/>
-            </w:pPr>
-            <w:r>
-              <w:t>    3 (  3.9) </w:t>
+              <w:t>    5 (  6.7) </w:t>
+            </w:r>
+          </w:p>
+        </w:tc>
+        <w:tc>
+          <w:p>
+            <w:pPr>
+              <w:pStyle w:stlname="Normal" w:val="Normal"/>
+            </w:pPr>
+            <w:r>
+              <w:t>    3 (  3.8) </w:t>
             </w:r>
           </w:p>
         </w:tc>
@@ -1350,17 +1350,17 @@
               <w:pStyle w:stlname="Normal" w:val="Normal"/>
             </w:pPr>
             <w:r>
-              <w:t>   32 ( 42.1) </w:t>
-            </w:r>
-          </w:p>
-        </w:tc>
-        <w:tc>
-          <w:p>
-            <w:pPr>
-              <w:pStyle w:stlname="Normal" w:val="Normal"/>
-            </w:pPr>
-            <w:r>
-              <w:t>    6 (  7.9) </w:t>
+              <w:t>   31 ( 41.3) </w:t>
+            </w:r>
+          </w:p>
+        </w:tc>
+        <w:tc>
+          <w:p>
+            <w:pPr>
+              <w:pStyle w:stlname="Normal" w:val="Normal"/>
+            </w:pPr>
+            <w:r>
+              <w:t>    7 (  9.1) </w:t>
             </w:r>
           </w:p>
         </w:tc>
@@ -1412,17 +1412,17 @@
               <w:pStyle w:stlname="Normal" w:val="Normal"/>
             </w:pPr>
             <w:r>
-              <w:t>   22 ( 28.9) </w:t>
-            </w:r>
-          </w:p>
-        </w:tc>
-        <w:tc>
-          <w:p>
-            <w:pPr>
-              <w:pStyle w:stlname="Normal" w:val="Normal"/>
-            </w:pPr>
-            <w:r>
-              <w:t>   13 ( 17.1) </w:t>
+              <w:t>   22 ( 29.3) </w:t>
+            </w:r>
+          </w:p>
+        </w:tc>
+        <w:tc>
+          <w:p>
+            <w:pPr>
+              <w:pStyle w:stlname="Normal" w:val="Normal"/>
+            </w:pPr>
+            <w:r>
+              <w:t>   13 ( 16.9) </w:t>
             </w:r>
           </w:p>
         </w:tc>
@@ -1474,17 +1474,17 @@
               <w:pStyle w:stlname="Normal" w:val="Normal"/>
             </w:pPr>
             <w:r>
-              <w:t>   22 ( 28.9) </w:t>
-            </w:r>
-          </w:p>
-        </w:tc>
-        <w:tc>
-          <w:p>
-            <w:pPr>
-              <w:pStyle w:stlname="Normal" w:val="Normal"/>
-            </w:pPr>
-            <w:r>
-              <w:t>   26 ( 34.2) </w:t>
+              <w:t>   22 ( 29.3) </w:t>
+            </w:r>
+          </w:p>
+        </w:tc>
+        <w:tc>
+          <w:p>
+            <w:pPr>
+              <w:pStyle w:stlname="Normal" w:val="Normal"/>
+            </w:pPr>
+            <w:r>
+              <w:t>   26 ( 33.8) </w:t>
             </w:r>
           </w:p>
         </w:tc>
@@ -1546,7 +1546,7 @@
               <w:pStyle w:stlname="Normal" w:val="Normal"/>
             </w:pPr>
             <w:r>
-              <w:t>   22 ( 28.9) </w:t>
+              <w:t>   22 ( 28.6) </w:t>
             </w:r>
           </w:p>
         </w:tc>
@@ -1608,7 +1608,7 @@
               <w:pStyle w:stlname="Normal" w:val="Normal"/>
             </w:pPr>
             <w:r>
-              <w:t>    9 ( 11.8) </w:t>
+              <w:t>    9 ( 11.7) </w:t>
             </w:r>
           </w:p>
         </w:tc>
@@ -1732,7 +1732,7 @@
               <w:pStyle w:stlname="Normal" w:val="Normal"/>
             </w:pPr>
             <w:r>
-              <w:t>    5 (  6.5) </w:t>
+              <w:t>    5 (  6.4) </w:t>
             </w:r>
           </w:p>
         </w:tc>
@@ -1784,17 +1784,17 @@
               <w:pStyle w:stlname="Normal" w:val="Normal"/>
             </w:pPr>
             <w:r>
-              <w:t>    6 (  7.9) </w:t>
-            </w:r>
-          </w:p>
-        </w:tc>
-        <w:tc>
-          <w:p>
-            <w:pPr>
-              <w:pStyle w:stlname="Normal" w:val="Normal"/>
-            </w:pPr>
-            <w:r>
-              <w:t>    5 (  6.5) </w:t>
+              <w:t>    6 (  8.0) </w:t>
+            </w:r>
+          </w:p>
+        </w:tc>
+        <w:tc>
+          <w:p>
+            <w:pPr>
+              <w:pStyle w:stlname="Normal" w:val="Normal"/>
+            </w:pPr>
+            <w:r>
+              <w:t>    5 (  6.4) </w:t>
             </w:r>
           </w:p>
         </w:tc>
@@ -1856,7 +1856,7 @@
               <w:pStyle w:stlname="Normal" w:val="Normal"/>
             </w:pPr>
             <w:r>
-              <w:t>    6 (  7.8) </w:t>
+              <w:t>    6 (  7.7) </w:t>
             </w:r>
           </w:p>
         </w:tc>
@@ -1918,7 +1918,7 @@
               <w:pStyle w:stlname="Normal" w:val="Normal"/>
             </w:pPr>
             <w:r>
-              <w:t>    9 ( 11.7) </w:t>
+              <w:t>    9 ( 11.5) </w:t>
             </w:r>
           </w:p>
         </w:tc>
@@ -1970,17 +1970,17 @@
               <w:pStyle w:stlname="Normal" w:val="Normal"/>
             </w:pPr>
             <w:r>
-              <w:t>   22 ( 28.9) </w:t>
-            </w:r>
-          </w:p>
-        </w:tc>
-        <w:tc>
-          <w:p>
-            <w:pPr>
-              <w:pStyle w:stlname="Normal" w:val="Normal"/>
-            </w:pPr>
-            <w:r>
-              <w:t>   15 ( 19.5) </w:t>
+              <w:t>   22 ( 29.3) </w:t>
+            </w:r>
+          </w:p>
+        </w:tc>
+        <w:tc>
+          <w:p>
+            <w:pPr>
+              <w:pStyle w:stlname="Normal" w:val="Normal"/>
+            </w:pPr>
+            <w:r>
+              <w:t>   15 ( 19.2) </w:t>
             </w:r>
           </w:p>
         </w:tc>
@@ -2042,7 +2042,7 @@
               <w:pStyle w:stlname="Normal" w:val="Normal"/>
             </w:pPr>
             <w:r>
-              <w:t>    8 ( 10.4) </w:t>
+              <w:t>    8 ( 10.3) </w:t>
             </w:r>
           </w:p>
         </w:tc>
@@ -2104,7 +2104,7 @@
               <w:pStyle w:stlname="Normal" w:val="Normal"/>
             </w:pPr>
             <w:r>
-              <w:t>    8 ( 10.4) </w:t>
+              <w:t>    8 ( 10.3) </w:t>
             </w:r>
           </w:p>
         </w:tc>
@@ -2166,7 +2166,7 @@
               <w:pStyle w:stlname="Normal" w:val="Normal"/>
             </w:pPr>
             <w:r>
-              <w:t>   12 ( 15.6) </w:t>
+              <w:t>   12 ( 15.4) </w:t>
             </w:r>
           </w:p>
         </w:tc>
@@ -2218,17 +2218,17 @@
               <w:pStyle w:stlname="Normal" w:val="Normal"/>
             </w:pPr>
             <w:r>
-              <w:t>   12 ( 15.8) </w:t>
-            </w:r>
-          </w:p>
-        </w:tc>
-        <w:tc>
-          <w:p>
-            <w:pPr>
-              <w:pStyle w:stlname="Normal" w:val="Normal"/>
-            </w:pPr>
-            <w:r>
-              <w:t>    6 (  7.8) </w:t>
+              <w:t>   12 ( 16.0) </w:t>
+            </w:r>
+          </w:p>
+        </w:tc>
+        <w:tc>
+          <w:p>
+            <w:pPr>
+              <w:pStyle w:stlname="Normal" w:val="Normal"/>
+            </w:pPr>
+            <w:r>
+              <w:t>    6 (  7.7) </w:t>
             </w:r>
           </w:p>
         </w:tc>
@@ -2280,17 +2280,17 @@
               <w:pStyle w:stlname="Normal" w:val="Normal"/>
             </w:pPr>
             <w:r>
-              <w:t>   23 ( 30.3) </w:t>
-            </w:r>
-          </w:p>
-        </w:tc>
-        <w:tc>
-          <w:p>
-            <w:pPr>
-              <w:pStyle w:stlname="Normal" w:val="Normal"/>
-            </w:pPr>
-            <w:r>
-              <w:t>    3 (  3.9) </w:t>
+              <w:t>   22 ( 29.3) </w:t>
+            </w:r>
+          </w:p>
+        </w:tc>
+        <w:tc>
+          <w:p>
+            <w:pPr>
+              <w:pStyle w:stlname="Normal" w:val="Normal"/>
+            </w:pPr>
+            <w:r>
+              <w:t>    4 (  5.1) </w:t>
             </w:r>
           </w:p>
         </w:tc>
@@ -2362,7 +2362,7 @@
               <w:pStyle w:stlname="Normal" w:val="Normal"/>
             </w:pPr>
             <w:r>
-              <w:t> 0.739</w:t>
+              <w:t> 0.867</w:t>
             </w:r>
           </w:p>
         </w:tc>
@@ -2528,7 +2528,7 @@
               <w:pStyle w:stlname="Normal" w:val="Normal"/>
             </w:pPr>
             <w:r>
-              <w:t>    3 (  3.9) </w:t>
+              <w:t>    3 (  4.0) </w:t>
             </w:r>
           </w:p>
         </w:tc>
@@ -2590,17 +2590,17 @@
               <w:pStyle w:stlname="Normal" w:val="Normal"/>
             </w:pPr>
             <w:r>
-              <w:t>   27 ( 35.5) </w:t>
-            </w:r>
-          </w:p>
-        </w:tc>
-        <w:tc>
-          <w:p>
-            <w:pPr>
-              <w:pStyle w:stlname="Normal" w:val="Normal"/>
-            </w:pPr>
-            <w:r>
-              <w:t>   19 ( 24.7) </w:t>
+              <w:t>   27 ( 36.0) </w:t>
+            </w:r>
+          </w:p>
+        </w:tc>
+        <w:tc>
+          <w:p>
+            <w:pPr>
+              <w:pStyle w:stlname="Normal" w:val="Normal"/>
+            </w:pPr>
+            <w:r>
+              <w:t>   19 ( 24.4) </w:t>
             </w:r>
           </w:p>
         </w:tc>
@@ -2652,6 +2652,16 @@
               <w:pStyle w:stlname="Normal" w:val="Normal"/>
             </w:pPr>
             <w:r>
+              <w:t>    2 (  2.7) </w:t>
+            </w:r>
+          </w:p>
+        </w:tc>
+        <w:tc>
+          <w:p>
+            <w:pPr>
+              <w:pStyle w:stlname="Normal" w:val="Normal"/>
+            </w:pPr>
+            <w:r>
               <w:t>    2 (  2.6) </w:t>
             </w:r>
           </w:p>
@@ -2662,6 +2672,182 @@
               <w:pStyle w:stlname="Normal" w:val="Normal"/>
             </w:pPr>
             <w:r>
+              <w:t/>
+            </w:r>
+          </w:p>
+        </w:tc>
+        <w:tc>
+          <w:p>
+            <w:pPr>
+              <w:pStyle w:stlname="Normal" w:val="Normal"/>
+            </w:pPr>
+            <w:r>
+              <w:t/>
+            </w:r>
+          </w:p>
+        </w:tc>
+      </w:tr>
+      <w:tr>
+        <w:tc>
+          <w:p>
+            <w:pPr>
+              <w:pStyle w:stlname="Normal" w:val="Normal"/>
+            </w:pPr>
+            <w:r>
+              <w:t/>
+            </w:r>
+          </w:p>
+        </w:tc>
+        <w:tc>
+          <w:p>
+            <w:pPr>
+              <w:pStyle w:stlname="Normal" w:val="Normal"/>
+            </w:pPr>
+            <w:r>
+              <w:t>P-Carboplatin</w:t>
+            </w:r>
+          </w:p>
+        </w:tc>
+        <w:tc>
+          <w:p>
+            <w:pPr>
+              <w:pStyle w:stlname="Normal" w:val="Normal"/>
+            </w:pPr>
+            <w:r>
+              <w:t>    0 (  0.0) </w:t>
+            </w:r>
+          </w:p>
+        </w:tc>
+        <w:tc>
+          <w:p>
+            <w:pPr>
+              <w:pStyle w:stlname="Normal" w:val="Normal"/>
+            </w:pPr>
+            <w:r>
+              <w:t>    1 (  1.3) </w:t>
+            </w:r>
+          </w:p>
+        </w:tc>
+        <w:tc>
+          <w:p>
+            <w:pPr>
+              <w:pStyle w:stlname="Normal" w:val="Normal"/>
+            </w:pPr>
+            <w:r>
+              <w:t/>
+            </w:r>
+          </w:p>
+        </w:tc>
+        <w:tc>
+          <w:p>
+            <w:pPr>
+              <w:pStyle w:stlname="Normal" w:val="Normal"/>
+            </w:pPr>
+            <w:r>
+              <w:t/>
+            </w:r>
+          </w:p>
+        </w:tc>
+      </w:tr>
+      <w:tr>
+        <w:tc>
+          <w:p>
+            <w:pPr>
+              <w:pStyle w:stlname="Normal" w:val="Normal"/>
+            </w:pPr>
+            <w:r>
+              <w:t/>
+            </w:r>
+          </w:p>
+        </w:tc>
+        <w:tc>
+          <w:p>
+            <w:pPr>
+              <w:pStyle w:stlname="Normal" w:val="Normal"/>
+            </w:pPr>
+            <w:r>
+              <w:t>P-EC</w:t>
+            </w:r>
+          </w:p>
+        </w:tc>
+        <w:tc>
+          <w:p>
+            <w:pPr>
+              <w:pStyle w:stlname="Normal" w:val="Normal"/>
+            </w:pPr>
+            <w:r>
+              <w:t>    3 (  4.0) </w:t>
+            </w:r>
+          </w:p>
+        </w:tc>
+        <w:tc>
+          <w:p>
+            <w:pPr>
+              <w:pStyle w:stlname="Normal" w:val="Normal"/>
+            </w:pPr>
+            <w:r>
+              <w:t>    1 (  1.3) </w:t>
+            </w:r>
+          </w:p>
+        </w:tc>
+        <w:tc>
+          <w:p>
+            <w:pPr>
+              <w:pStyle w:stlname="Normal" w:val="Normal"/>
+            </w:pPr>
+            <w:r>
+              <w:t/>
+            </w:r>
+          </w:p>
+        </w:tc>
+        <w:tc>
+          <w:p>
+            <w:pPr>
+              <w:pStyle w:stlname="Normal" w:val="Normal"/>
+            </w:pPr>
+            <w:r>
+              <w:t/>
+            </w:r>
+          </w:p>
+        </w:tc>
+      </w:tr>
+      <w:tr>
+        <w:tc>
+          <w:p>
+            <w:pPr>
+              <w:pStyle w:stlname="Normal" w:val="Normal"/>
+            </w:pPr>
+            <w:r>
+              <w:t/>
+            </w:r>
+          </w:p>
+        </w:tc>
+        <w:tc>
+          <w:p>
+            <w:pPr>
+              <w:pStyle w:stlname="Normal" w:val="Normal"/>
+            </w:pPr>
+            <w:r>
+              <w:t>P-FEC</w:t>
+            </w:r>
+          </w:p>
+        </w:tc>
+        <w:tc>
+          <w:p>
+            <w:pPr>
+              <w:pStyle w:stlname="Normal" w:val="Normal"/>
+            </w:pPr>
+            <w:r>
+              <w:t>    3 (  4.0) </w:t>
+            </w:r>
+          </w:p>
+        </w:tc>
+        <w:tc>
+          <w:p>
+            <w:pPr>
+              <w:pStyle w:stlname="Normal" w:val="Normal"/>
+            </w:pPr>
+            <w:r>
               <w:t>    2 (  2.6) </w:t>
             </w:r>
           </w:p>
@@ -2704,7 +2890,7 @@
               <w:pStyle w:stlname="Normal" w:val="Normal"/>
             </w:pPr>
             <w:r>
-              <w:t>P-Carboplatin</w:t>
+              <w:t>P + Trastuzumab</w:t>
             </w:r>
           </w:p>
         </w:tc>
@@ -2766,17 +2952,7 @@
               <w:pStyle w:stlname="Normal" w:val="Normal"/>
             </w:pPr>
             <w:r>
-              <w:t>P-EC</w:t>
-            </w:r>
-          </w:p>
-        </w:tc>
-        <w:tc>
-          <w:p>
-            <w:pPr>
-              <w:pStyle w:stlname="Normal" w:val="Normal"/>
-            </w:pPr>
-            <w:r>
-              <w:t>    3 (  3.9) </w:t>
+              <w:t>T</w:t>
             </w:r>
           </w:p>
         </w:tc>
@@ -2796,49 +2972,245 @@
               <w:pStyle w:stlname="Normal" w:val="Normal"/>
             </w:pPr>
             <w:r>
-              <w:t/>
-            </w:r>
-          </w:p>
-        </w:tc>
-        <w:tc>
-          <w:p>
-            <w:pPr>
-              <w:pStyle w:stlname="Normal" w:val="Normal"/>
-            </w:pPr>
-            <w:r>
-              <w:t/>
-            </w:r>
-          </w:p>
-        </w:tc>
-      </w:tr>
-      <w:tr>
-        <w:tc>
-          <w:p>
-            <w:pPr>
-              <w:pStyle w:stlname="Normal" w:val="Normal"/>
-            </w:pPr>
-            <w:r>
-              <w:t/>
-            </w:r>
-          </w:p>
-        </w:tc>
-        <w:tc>
-          <w:p>
-            <w:pPr>
-              <w:pStyle w:stlname="Normal" w:val="Normal"/>
-            </w:pPr>
-            <w:r>
-              <w:t>P-FEC</w:t>
-            </w:r>
-          </w:p>
-        </w:tc>
-        <w:tc>
-          <w:p>
-            <w:pPr>
-              <w:pStyle w:stlname="Normal" w:val="Normal"/>
-            </w:pPr>
-            <w:r>
-              <w:t>    4 (  5.3) </w:t>
+              <w:t>    0 (  0.0) </w:t>
+            </w:r>
+          </w:p>
+        </w:tc>
+        <w:tc>
+          <w:p>
+            <w:pPr>
+              <w:pStyle w:stlname="Normal" w:val="Normal"/>
+            </w:pPr>
+            <w:r>
+              <w:t/>
+            </w:r>
+          </w:p>
+        </w:tc>
+        <w:tc>
+          <w:p>
+            <w:pPr>
+              <w:pStyle w:stlname="Normal" w:val="Normal"/>
+            </w:pPr>
+            <w:r>
+              <w:t/>
+            </w:r>
+          </w:p>
+        </w:tc>
+      </w:tr>
+      <w:tr>
+        <w:tc>
+          <w:p>
+            <w:pPr>
+              <w:pStyle w:stlname="Normal" w:val="Normal"/>
+            </w:pPr>
+            <w:r>
+              <w:t/>
+            </w:r>
+          </w:p>
+        </w:tc>
+        <w:tc>
+          <w:p>
+            <w:pPr>
+              <w:pStyle w:stlname="Normal" w:val="Normal"/>
+            </w:pPr>
+            <w:r>
+              <w:t>T-Carboplatin</w:t>
+            </w:r>
+          </w:p>
+        </w:tc>
+        <w:tc>
+          <w:p>
+            <w:pPr>
+              <w:pStyle w:stlname="Normal" w:val="Normal"/>
+            </w:pPr>
+            <w:r>
+              <w:t>    0 (  0.0) </w:t>
+            </w:r>
+          </w:p>
+        </w:tc>
+        <w:tc>
+          <w:p>
+            <w:pPr>
+              <w:pStyle w:stlname="Normal" w:val="Normal"/>
+            </w:pPr>
+            <w:r>
+              <w:t>    2 (  2.6) </w:t>
+            </w:r>
+          </w:p>
+        </w:tc>
+        <w:tc>
+          <w:p>
+            <w:pPr>
+              <w:pStyle w:stlname="Normal" w:val="Normal"/>
+            </w:pPr>
+            <w:r>
+              <w:t/>
+            </w:r>
+          </w:p>
+        </w:tc>
+        <w:tc>
+          <w:p>
+            <w:pPr>
+              <w:pStyle w:stlname="Normal" w:val="Normal"/>
+            </w:pPr>
+            <w:r>
+              <w:t/>
+            </w:r>
+          </w:p>
+        </w:tc>
+      </w:tr>
+      <w:tr>
+        <w:tc>
+          <w:p>
+            <w:pPr>
+              <w:pStyle w:stlname="Normal" w:val="Normal"/>
+            </w:pPr>
+            <w:r>
+              <w:t/>
+            </w:r>
+          </w:p>
+        </w:tc>
+        <w:tc>
+          <w:p>
+            <w:pPr>
+              <w:pStyle w:stlname="Normal" w:val="Normal"/>
+            </w:pPr>
+            <w:r>
+              <w:t>T-EC</w:t>
+            </w:r>
+          </w:p>
+        </w:tc>
+        <w:tc>
+          <w:p>
+            <w:pPr>
+              <w:pStyle w:stlname="Normal" w:val="Normal"/>
+            </w:pPr>
+            <w:r>
+              <w:t>    3 (  4.0) </w:t>
+            </w:r>
+          </w:p>
+        </w:tc>
+        <w:tc>
+          <w:p>
+            <w:pPr>
+              <w:pStyle w:stlname="Normal" w:val="Normal"/>
+            </w:pPr>
+            <w:r>
+              <w:t>    5 (  6.4) </w:t>
+            </w:r>
+          </w:p>
+        </w:tc>
+        <w:tc>
+          <w:p>
+            <w:pPr>
+              <w:pStyle w:stlname="Normal" w:val="Normal"/>
+            </w:pPr>
+            <w:r>
+              <w:t/>
+            </w:r>
+          </w:p>
+        </w:tc>
+        <w:tc>
+          <w:p>
+            <w:pPr>
+              <w:pStyle w:stlname="Normal" w:val="Normal"/>
+            </w:pPr>
+            <w:r>
+              <w:t/>
+            </w:r>
+          </w:p>
+        </w:tc>
+      </w:tr>
+      <w:tr>
+        <w:tc>
+          <w:p>
+            <w:pPr>
+              <w:pStyle w:stlname="Normal" w:val="Normal"/>
+            </w:pPr>
+            <w:r>
+              <w:t/>
+            </w:r>
+          </w:p>
+        </w:tc>
+        <w:tc>
+          <w:p>
+            <w:pPr>
+              <w:pStyle w:stlname="Normal" w:val="Normal"/>
+            </w:pPr>
+            <w:r>
+              <w:t>T-FEC</w:t>
+            </w:r>
+          </w:p>
+        </w:tc>
+        <w:tc>
+          <w:p>
+            <w:pPr>
+              <w:pStyle w:stlname="Normal" w:val="Normal"/>
+            </w:pPr>
+            <w:r>
+              <w:t>   27 ( 36.0) </w:t>
+            </w:r>
+          </w:p>
+        </w:tc>
+        <w:tc>
+          <w:p>
+            <w:pPr>
+              <w:pStyle w:stlname="Normal" w:val="Normal"/>
+            </w:pPr>
+            <w:r>
+              <w:t>   34 ( 43.6) </w:t>
+            </w:r>
+          </w:p>
+        </w:tc>
+        <w:tc>
+          <w:p>
+            <w:pPr>
+              <w:pStyle w:stlname="Normal" w:val="Normal"/>
+            </w:pPr>
+            <w:r>
+              <w:t/>
+            </w:r>
+          </w:p>
+        </w:tc>
+        <w:tc>
+          <w:p>
+            <w:pPr>
+              <w:pStyle w:stlname="Normal" w:val="Normal"/>
+            </w:pPr>
+            <w:r>
+              <w:t/>
+            </w:r>
+          </w:p>
+        </w:tc>
+      </w:tr>
+      <w:tr>
+        <w:tc>
+          <w:p>
+            <w:pPr>
+              <w:pStyle w:stlname="Normal" w:val="Normal"/>
+            </w:pPr>
+            <w:r>
+              <w:t/>
+            </w:r>
+          </w:p>
+        </w:tc>
+        <w:tc>
+          <w:p>
+            <w:pPr>
+              <w:pStyle w:stlname="Normal" w:val="Normal"/>
+            </w:pPr>
+            <w:r>
+              <w:t>T-FEC + Trastuzumab</w:t>
+            </w:r>
+          </w:p>
+        </w:tc>
+        <w:tc>
+          <w:p>
+            <w:pPr>
+              <w:pStyle w:stlname="Normal" w:val="Normal"/>
+            </w:pPr>
+            <w:r>
+              <w:t>    0 (  0.0) </w:t>
             </w:r>
           </w:p>
         </w:tc>
@@ -2890,7 +3262,79 @@
               <w:pStyle w:stlname="Normal" w:val="Normal"/>
             </w:pPr>
             <w:r>
-              <w:t>P + Trastuzumab</w:t>
+              <w:t>T-FEC + Trastuzumab + Pertuzumab</w:t>
+            </w:r>
+          </w:p>
+        </w:tc>
+        <w:tc>
+          <w:p>
+            <w:pPr>
+              <w:pStyle w:stlname="Normal" w:val="Normal"/>
+            </w:pPr>
+            <w:r>
+              <w:t>    1 (  1.3) </w:t>
+            </w:r>
+          </w:p>
+        </w:tc>
+        <w:tc>
+          <w:p>
+            <w:pPr>
+              <w:pStyle w:stlname="Normal" w:val="Normal"/>
+            </w:pPr>
+            <w:r>
+              <w:t>    1 (  1.3) </w:t>
+            </w:r>
+          </w:p>
+        </w:tc>
+        <w:tc>
+          <w:p>
+            <w:pPr>
+              <w:pStyle w:stlname="Normal" w:val="Normal"/>
+            </w:pPr>
+            <w:r>
+              <w:t/>
+            </w:r>
+          </w:p>
+        </w:tc>
+        <w:tc>
+          <w:p>
+            <w:pPr>
+              <w:pStyle w:stlname="Normal" w:val="Normal"/>
+            </w:pPr>
+            <w:r>
+              <w:t/>
+            </w:r>
+          </w:p>
+        </w:tc>
+      </w:tr>
+      <w:tr>
+        <w:tc>
+          <w:p>
+            <w:pPr>
+              <w:pStyle w:stlname="Normal" w:val="Normal"/>
+            </w:pPr>
+            <w:r>
+              <w:t/>
+            </w:r>
+          </w:p>
+        </w:tc>
+        <w:tc>
+          <w:p>
+            <w:pPr>
+              <w:pStyle w:stlname="Normal" w:val="Normal"/>
+            </w:pPr>
+            <w:r>
+              <w:t>T + Pertuzumab + Trastuzumab</w:t>
+            </w:r>
+          </w:p>
+        </w:tc>
+        <w:tc>
+          <w:p>
+            <w:pPr>
+              <w:pStyle w:stlname="Normal" w:val="Normal"/>
+            </w:pPr>
+            <w:r>
+              <w:t>    1 (  1.3) </w:t>
             </w:r>
           </w:p>
         </w:tc>
@@ -2910,6 +3354,48 @@
               <w:pStyle w:stlname="Normal" w:val="Normal"/>
             </w:pPr>
             <w:r>
+              <w:t/>
+            </w:r>
+          </w:p>
+        </w:tc>
+        <w:tc>
+          <w:p>
+            <w:pPr>
+              <w:pStyle w:stlname="Normal" w:val="Normal"/>
+            </w:pPr>
+            <w:r>
+              <w:t/>
+            </w:r>
+          </w:p>
+        </w:tc>
+      </w:tr>
+      <w:tr>
+        <w:tc>
+          <w:p>
+            <w:pPr>
+              <w:pStyle w:stlname="Normal" w:val="Normal"/>
+            </w:pPr>
+            <w:r>
+              <w:t/>
+            </w:r>
+          </w:p>
+        </w:tc>
+        <w:tc>
+          <w:p>
+            <w:pPr>
+              <w:pStyle w:stlname="Normal" w:val="Normal"/>
+            </w:pPr>
+            <w:r>
+              <w:t>TC</w:t>
+            </w:r>
+          </w:p>
+        </w:tc>
+        <w:tc>
+          <w:p>
+            <w:pPr>
+              <w:pStyle w:stlname="Normal" w:val="Normal"/>
+            </w:pPr>
+            <w:r>
               <w:t>    1 (  1.3) </w:t>
             </w:r>
           </w:p>
@@ -2920,120 +3406,6 @@
               <w:pStyle w:stlname="Normal" w:val="Normal"/>
             </w:pPr>
             <w:r>
-              <w:t/>
-            </w:r>
-          </w:p>
-        </w:tc>
-        <w:tc>
-          <w:p>
-            <w:pPr>
-              <w:pStyle w:stlname="Normal" w:val="Normal"/>
-            </w:pPr>
-            <w:r>
-              <w:t/>
-            </w:r>
-          </w:p>
-        </w:tc>
-      </w:tr>
-      <w:tr>
-        <w:tc>
-          <w:p>
-            <w:pPr>
-              <w:pStyle w:stlname="Normal" w:val="Normal"/>
-            </w:pPr>
-            <w:r>
-              <w:t/>
-            </w:r>
-          </w:p>
-        </w:tc>
-        <w:tc>
-          <w:p>
-            <w:pPr>
-              <w:pStyle w:stlname="Normal" w:val="Normal"/>
-            </w:pPr>
-            <w:r>
-              <w:t>T</w:t>
-            </w:r>
-          </w:p>
-        </w:tc>
-        <w:tc>
-          <w:p>
-            <w:pPr>
-              <w:pStyle w:stlname="Normal" w:val="Normal"/>
-            </w:pPr>
-            <w:r>
-              <w:t>    1 (  1.3) </w:t>
-            </w:r>
-          </w:p>
-        </w:tc>
-        <w:tc>
-          <w:p>
-            <w:pPr>
-              <w:pStyle w:stlname="Normal" w:val="Normal"/>
-            </w:pPr>
-            <w:r>
-              <w:t>    0 (  0.0) </w:t>
-            </w:r>
-          </w:p>
-        </w:tc>
-        <w:tc>
-          <w:p>
-            <w:pPr>
-              <w:pStyle w:stlname="Normal" w:val="Normal"/>
-            </w:pPr>
-            <w:r>
-              <w:t/>
-            </w:r>
-          </w:p>
-        </w:tc>
-        <w:tc>
-          <w:p>
-            <w:pPr>
-              <w:pStyle w:stlname="Normal" w:val="Normal"/>
-            </w:pPr>
-            <w:r>
-              <w:t/>
-            </w:r>
-          </w:p>
-        </w:tc>
-      </w:tr>
-      <w:tr>
-        <w:tc>
-          <w:p>
-            <w:pPr>
-              <w:pStyle w:stlname="Normal" w:val="Normal"/>
-            </w:pPr>
-            <w:r>
-              <w:t/>
-            </w:r>
-          </w:p>
-        </w:tc>
-        <w:tc>
-          <w:p>
-            <w:pPr>
-              <w:pStyle w:stlname="Normal" w:val="Normal"/>
-            </w:pPr>
-            <w:r>
-              <w:t>T-Carboplatin</w:t>
-            </w:r>
-          </w:p>
-        </w:tc>
-        <w:tc>
-          <w:p>
-            <w:pPr>
-              <w:pStyle w:stlname="Normal" w:val="Normal"/>
-            </w:pPr>
-            <w:r>
-              <w:t>    0 (  0.0) </w:t>
-            </w:r>
-          </w:p>
-        </w:tc>
-        <w:tc>
-          <w:p>
-            <w:pPr>
-              <w:pStyle w:stlname="Normal" w:val="Normal"/>
-            </w:pPr>
-            <w:r>
               <w:t>    2 (  2.6) </w:t>
             </w:r>
           </w:p>
@@ -3076,327 +3448,17 @@
               <w:pStyle w:stlname="Normal" w:val="Normal"/>
             </w:pPr>
             <w:r>
-              <w:t>T-EC</w:t>
-            </w:r>
-          </w:p>
-        </w:tc>
-        <w:tc>
-          <w:p>
-            <w:pPr>
-              <w:pStyle w:stlname="Normal" w:val="Normal"/>
-            </w:pPr>
-            <w:r>
-              <w:t>    3 (  3.9) </w:t>
-            </w:r>
-          </w:p>
-        </w:tc>
-        <w:tc>
-          <w:p>
-            <w:pPr>
-              <w:pStyle w:stlname="Normal" w:val="Normal"/>
-            </w:pPr>
-            <w:r>
-              <w:t>    5 (  6.5) </w:t>
-            </w:r>
-          </w:p>
-        </w:tc>
-        <w:tc>
-          <w:p>
-            <w:pPr>
-              <w:pStyle w:stlname="Normal" w:val="Normal"/>
-            </w:pPr>
-            <w:r>
-              <w:t/>
-            </w:r>
-          </w:p>
-        </w:tc>
-        <w:tc>
-          <w:p>
-            <w:pPr>
-              <w:pStyle w:stlname="Normal" w:val="Normal"/>
-            </w:pPr>
-            <w:r>
-              <w:t/>
-            </w:r>
-          </w:p>
-        </w:tc>
-      </w:tr>
-      <w:tr>
-        <w:tc>
-          <w:p>
-            <w:pPr>
-              <w:pStyle w:stlname="Normal" w:val="Normal"/>
-            </w:pPr>
-            <w:r>
-              <w:t/>
-            </w:r>
-          </w:p>
-        </w:tc>
-        <w:tc>
-          <w:p>
-            <w:pPr>
-              <w:pStyle w:stlname="Normal" w:val="Normal"/>
-            </w:pPr>
-            <w:r>
-              <w:t>T-FEC</w:t>
-            </w:r>
-          </w:p>
-        </w:tc>
-        <w:tc>
-          <w:p>
-            <w:pPr>
-              <w:pStyle w:stlname="Normal" w:val="Normal"/>
-            </w:pPr>
-            <w:r>
-              <w:t>   27 ( 35.5) </w:t>
-            </w:r>
-          </w:p>
-        </w:tc>
-        <w:tc>
-          <w:p>
-            <w:pPr>
-              <w:pStyle w:stlname="Normal" w:val="Normal"/>
-            </w:pPr>
-            <w:r>
-              <w:t>   34 ( 44.2) </w:t>
-            </w:r>
-          </w:p>
-        </w:tc>
-        <w:tc>
-          <w:p>
-            <w:pPr>
-              <w:pStyle w:stlname="Normal" w:val="Normal"/>
-            </w:pPr>
-            <w:r>
-              <w:t/>
-            </w:r>
-          </w:p>
-        </w:tc>
-        <w:tc>
-          <w:p>
-            <w:pPr>
-              <w:pStyle w:stlname="Normal" w:val="Normal"/>
-            </w:pPr>
-            <w:r>
-              <w:t/>
-            </w:r>
-          </w:p>
-        </w:tc>
-      </w:tr>
-      <w:tr>
-        <w:tc>
-          <w:p>
-            <w:pPr>
-              <w:pStyle w:stlname="Normal" w:val="Normal"/>
-            </w:pPr>
-            <w:r>
-              <w:t/>
-            </w:r>
-          </w:p>
-        </w:tc>
-        <w:tc>
-          <w:p>
-            <w:pPr>
-              <w:pStyle w:stlname="Normal" w:val="Normal"/>
-            </w:pPr>
-            <w:r>
-              <w:t>T-FEC + Trastuzumab</w:t>
-            </w:r>
-          </w:p>
-        </w:tc>
-        <w:tc>
-          <w:p>
-            <w:pPr>
-              <w:pStyle w:stlname="Normal" w:val="Normal"/>
-            </w:pPr>
-            <w:r>
-              <w:t>    0 (  0.0) </w:t>
-            </w:r>
-          </w:p>
-        </w:tc>
-        <w:tc>
-          <w:p>
-            <w:pPr>
-              <w:pStyle w:stlname="Normal" w:val="Normal"/>
-            </w:pPr>
-            <w:r>
-              <w:t>    1 (  1.3) </w:t>
-            </w:r>
-          </w:p>
-        </w:tc>
-        <w:tc>
-          <w:p>
-            <w:pPr>
-              <w:pStyle w:stlname="Normal" w:val="Normal"/>
-            </w:pPr>
-            <w:r>
-              <w:t/>
-            </w:r>
-          </w:p>
-        </w:tc>
-        <w:tc>
-          <w:p>
-            <w:pPr>
-              <w:pStyle w:stlname="Normal" w:val="Normal"/>
-            </w:pPr>
-            <w:r>
-              <w:t/>
-            </w:r>
-          </w:p>
-        </w:tc>
-      </w:tr>
-      <w:tr>
-        <w:tc>
-          <w:p>
-            <w:pPr>
-              <w:pStyle w:stlname="Normal" w:val="Normal"/>
-            </w:pPr>
-            <w:r>
-              <w:t/>
-            </w:r>
-          </w:p>
-        </w:tc>
-        <w:tc>
-          <w:p>
-            <w:pPr>
-              <w:pStyle w:stlname="Normal" w:val="Normal"/>
-            </w:pPr>
-            <w:r>
-              <w:t>T-FEC + Trastuzumab + Pertuzumab</w:t>
-            </w:r>
-          </w:p>
-        </w:tc>
-        <w:tc>
-          <w:p>
-            <w:pPr>
-              <w:pStyle w:stlname="Normal" w:val="Normal"/>
-            </w:pPr>
-            <w:r>
-              <w:t>    1 (  1.3) </w:t>
-            </w:r>
-          </w:p>
-        </w:tc>
-        <w:tc>
-          <w:p>
-            <w:pPr>
-              <w:pStyle w:stlname="Normal" w:val="Normal"/>
-            </w:pPr>
-            <w:r>
-              <w:t>    1 (  1.3) </w:t>
-            </w:r>
-          </w:p>
-        </w:tc>
-        <w:tc>
-          <w:p>
-            <w:pPr>
-              <w:pStyle w:stlname="Normal" w:val="Normal"/>
-            </w:pPr>
-            <w:r>
-              <w:t/>
-            </w:r>
-          </w:p>
-        </w:tc>
-        <w:tc>
-          <w:p>
-            <w:pPr>
-              <w:pStyle w:stlname="Normal" w:val="Normal"/>
-            </w:pPr>
-            <w:r>
-              <w:t/>
-            </w:r>
-          </w:p>
-        </w:tc>
-      </w:tr>
-      <w:tr>
-        <w:tc>
-          <w:p>
-            <w:pPr>
-              <w:pStyle w:stlname="Normal" w:val="Normal"/>
-            </w:pPr>
-            <w:r>
-              <w:t/>
-            </w:r>
-          </w:p>
-        </w:tc>
-        <w:tc>
-          <w:p>
-            <w:pPr>
-              <w:pStyle w:stlname="Normal" w:val="Normal"/>
-            </w:pPr>
-            <w:r>
-              <w:t>T + Pertuzumab + Trastuzumab</w:t>
-            </w:r>
-          </w:p>
-        </w:tc>
-        <w:tc>
-          <w:p>
-            <w:pPr>
-              <w:pStyle w:stlname="Normal" w:val="Normal"/>
-            </w:pPr>
-            <w:r>
-              <w:t>    1 (  1.3) </w:t>
-            </w:r>
-          </w:p>
-        </w:tc>
-        <w:tc>
-          <w:p>
-            <w:pPr>
-              <w:pStyle w:stlname="Normal" w:val="Normal"/>
-            </w:pPr>
-            <w:r>
-              <w:t>    0 (  0.0) </w:t>
-            </w:r>
-          </w:p>
-        </w:tc>
-        <w:tc>
-          <w:p>
-            <w:pPr>
-              <w:pStyle w:stlname="Normal" w:val="Normal"/>
-            </w:pPr>
-            <w:r>
-              <w:t/>
-            </w:r>
-          </w:p>
-        </w:tc>
-        <w:tc>
-          <w:p>
-            <w:pPr>
-              <w:pStyle w:stlname="Normal" w:val="Normal"/>
-            </w:pPr>
-            <w:r>
-              <w:t/>
-            </w:r>
-          </w:p>
-        </w:tc>
-      </w:tr>
-      <w:tr>
-        <w:tc>
-          <w:p>
-            <w:pPr>
-              <w:pStyle w:stlname="Normal" w:val="Normal"/>
-            </w:pPr>
-            <w:r>
-              <w:t/>
-            </w:r>
-          </w:p>
-        </w:tc>
-        <w:tc>
-          <w:p>
-            <w:pPr>
-              <w:pStyle w:stlname="Normal" w:val="Normal"/>
-            </w:pPr>
-            <w:r>
-              <w:t>TC</w:t>
-            </w:r>
-          </w:p>
-        </w:tc>
-        <w:tc>
-          <w:p>
-            <w:pPr>
-              <w:pStyle w:stlname="Normal" w:val="Normal"/>
-            </w:pPr>
-            <w:r>
-              <w:t>    1 (  1.3) </w:t>
+              <w:t>TC + Trastuzumab</w:t>
+            </w:r>
+          </w:p>
+        </w:tc>
+        <w:tc>
+          <w:p>
+            <w:pPr>
+              <w:pStyle w:stlname="Normal" w:val="Normal"/>
+            </w:pPr>
+            <w:r>
+              <w:t>    2 (  2.7) </w:t>
             </w:r>
           </w:p>
         </w:tc>
@@ -3438,68 +3500,6 @@
               <w:pStyle w:stlname="Normal" w:val="Normal"/>
             </w:pPr>
             <w:r>
-              <w:t/>
-            </w:r>
-          </w:p>
-        </w:tc>
-        <w:tc>
-          <w:p>
-            <w:pPr>
-              <w:pStyle w:stlname="Normal" w:val="Normal"/>
-            </w:pPr>
-            <w:r>
-              <w:t>TC + Trastuzumab</w:t>
-            </w:r>
-          </w:p>
-        </w:tc>
-        <w:tc>
-          <w:p>
-            <w:pPr>
-              <w:pStyle w:stlname="Normal" w:val="Normal"/>
-            </w:pPr>
-            <w:r>
-              <w:t>    2 (  2.6) </w:t>
-            </w:r>
-          </w:p>
-        </w:tc>
-        <w:tc>
-          <w:p>
-            <w:pPr>
-              <w:pStyle w:stlname="Normal" w:val="Normal"/>
-            </w:pPr>
-            <w:r>
-              <w:t>    2 (  2.6) </w:t>
-            </w:r>
-          </w:p>
-        </w:tc>
-        <w:tc>
-          <w:p>
-            <w:pPr>
-              <w:pStyle w:stlname="Normal" w:val="Normal"/>
-            </w:pPr>
-            <w:r>
-              <w:t/>
-            </w:r>
-          </w:p>
-        </w:tc>
-        <w:tc>
-          <w:p>
-            <w:pPr>
-              <w:pStyle w:stlname="Normal" w:val="Normal"/>
-            </w:pPr>
-            <w:r>
-              <w:t/>
-            </w:r>
-          </w:p>
-        </w:tc>
-      </w:tr>
-      <w:tr>
-        <w:tc>
-          <w:p>
-            <w:pPr>
-              <w:pStyle w:stlname="Normal" w:val="Normal"/>
-            </w:pPr>
-            <w:r>
               <w:t>Chemo.cycles </w:t>
             </w:r>
           </w:p>
@@ -3520,27 +3520,27 @@
               <w:pStyle w:stlname="Normal" w:val="Normal"/>
             </w:pPr>
             <w:r>
-              <w:t> 5.95 ± 0.75</w:t>
-            </w:r>
-          </w:p>
-        </w:tc>
-        <w:tc>
-          <w:p>
-            <w:pPr>
-              <w:pStyle w:stlname="Normal" w:val="Normal"/>
-            </w:pPr>
-            <w:r>
-              <w:t> 5.83 ± 0.64</w:t>
-            </w:r>
-          </w:p>
-        </w:tc>
-        <w:tc>
-          <w:p>
-            <w:pPr>
-              <w:pStyle w:stlname="Normal" w:val="Normal"/>
-            </w:pPr>
-            <w:r>
-              <w:t> 0.302</w:t>
+              <w:t> 5.93 ± 0.74</w:t>
+            </w:r>
+          </w:p>
+        </w:tc>
+        <w:tc>
+          <w:p>
+            <w:pPr>
+              <w:pStyle w:stlname="Normal" w:val="Normal"/>
+            </w:pPr>
+            <w:r>
+              <w:t> 5.85 ± 0.65</w:t>
+            </w:r>
+          </w:p>
+        </w:tc>
+        <w:tc>
+          <w:p>
+            <w:pPr>
+              <w:pStyle w:stlname="Normal" w:val="Normal"/>
+            </w:pPr>
+            <w:r>
+              <w:t> 0.440</w:t>
             </w:r>
           </w:p>
         </w:tc>
@@ -3644,17 +3644,17 @@
               <w:pStyle w:stlname="Normal" w:val="Normal"/>
             </w:pPr>
             <w:r>
-              <w:t> 1.13 [0.00, 1.88]</w:t>
-            </w:r>
-          </w:p>
-        </w:tc>
-        <w:tc>
-          <w:p>
-            <w:pPr>
-              <w:pStyle w:stlname="Normal" w:val="Normal"/>
-            </w:pPr>
-            <w:r>
-              <w:t> 2.47 [1.06, 3.37]</w:t>
+              <w:t> 1.14 [0.00, 1.88]</w:t>
+            </w:r>
+          </w:p>
+        </w:tc>
+        <w:tc>
+          <w:p>
+            <w:pPr>
+              <w:pStyle w:stlname="Normal" w:val="Normal"/>
+            </w:pPr>
+            <w:r>
+              <w:t> 2.44 [1.04, 3.37]</w:t>
             </w:r>
           </w:p>
         </w:tc>
@@ -3706,17 +3706,17 @@
               <w:pStyle w:stlname="Normal" w:val="Normal"/>
             </w:pPr>
             <w:r>
-              <w:t> 0.27 [-0.37, 0.58]</w:t>
-            </w:r>
-          </w:p>
-        </w:tc>
-        <w:tc>
-          <w:p>
-            <w:pPr>
-              <w:pStyle w:stlname="Normal" w:val="Normal"/>
-            </w:pPr>
-            <w:r>
-              <w:t>-0.30 [-0.57, 0.35]</w:t>
+              <w:t> 0.27 [-0.38, 0.58]</w:t>
+            </w:r>
+          </w:p>
+        </w:tc>
+        <w:tc>
+          <w:p>
+            <w:pPr>
+              <w:pStyle w:stlname="Normal" w:val="Normal"/>
+            </w:pPr>
+            <w:r>
+              <w:t>-0.29 [-0.57, 0.34]</w:t>
             </w:r>
           </w:p>
         </w:tc>
@@ -3768,17 +3768,17 @@
               <w:pStyle w:stlname="Normal" w:val="Normal"/>
             </w:pPr>
             <w:r>
-              <w:t> 0.41 [0.21, 0.56]</w:t>
-            </w:r>
-          </w:p>
-        </w:tc>
-        <w:tc>
-          <w:p>
-            <w:pPr>
-              <w:pStyle w:stlname="Normal" w:val="Normal"/>
-            </w:pPr>
-            <w:r>
-              <w:t>-0.51 [-0.60, -0.17]</w:t>
+              <w:t> 0.41 [0.20, 0.57]</w:t>
+            </w:r>
+          </w:p>
+        </w:tc>
+        <w:tc>
+          <w:p>
+            <w:pPr>
+              <w:pStyle w:stlname="Normal" w:val="Normal"/>
+            </w:pPr>
+            <w:r>
+              <w:t>-0.51 [-0.60, -0.11]</w:t>
             </w:r>
           </w:p>
         </w:tc>
@@ -3830,17 +3830,17 @@
               <w:pStyle w:stlname="Normal" w:val="Normal"/>
             </w:pPr>
             <w:r>
-              <w:t> 0.26 [0.01, 0.41]</w:t>
-            </w:r>
-          </w:p>
-        </w:tc>
-        <w:tc>
-          <w:p>
-            <w:pPr>
-              <w:pStyle w:stlname="Normal" w:val="Normal"/>
-            </w:pPr>
-            <w:r>
-              <w:t>-0.34 [-0.48, -0.05]</w:t>
+              <w:t> 0.27 [0.00, 0.42]</w:t>
+            </w:r>
+          </w:p>
+        </w:tc>
+        <w:tc>
+          <w:p>
+            <w:pPr>
+              <w:pStyle w:stlname="Normal" w:val="Normal"/>
+            </w:pPr>
+            <w:r>
+              <w:t>-0.32 [-0.48, -0.05]</w:t>
             </w:r>
           </w:p>
         </w:tc>
@@ -3892,17 +3892,17 @@
               <w:pStyle w:stlname="Normal" w:val="Normal"/>
             </w:pPr>
             <w:r>
-              <w:t> 2.50 [1.58, 3.41]</w:t>
-            </w:r>
-          </w:p>
-        </w:tc>
-        <w:tc>
-          <w:p>
-            <w:pPr>
-              <w:pStyle w:stlname="Normal" w:val="Normal"/>
-            </w:pPr>
-            <w:r>
-              <w:t> 1.12 [0.77, 1.60]</w:t>
+              <w:t> 2.46 [1.57, 3.38]</w:t>
+            </w:r>
+          </w:p>
+        </w:tc>
+        <w:tc>
+          <w:p>
+            <w:pPr>
+              <w:pStyle w:stlname="Normal" w:val="Normal"/>
+            </w:pPr>
+            <w:r>
+              <w:t> 1.13 [0.77, 1.64]</w:t>
             </w:r>
           </w:p>
         </w:tc>
@@ -3954,7 +3954,7 @@
               <w:pStyle w:stlname="Normal" w:val="Normal"/>
             </w:pPr>
             <w:r>
-              <w:t>30.50 [22.75, 39.25]</w:t>
+              <w:t>30.00 [22.50, 39.50]</w:t>
             </w:r>
           </w:p>
         </w:tc>

</xml_diff>